<commit_message>
Stop tracking mp4 (local only); make URLs clickable hyperlinks in report.docx
Co-Authored-By: Claude Sonnet 5.5 <noreply@anthropic.com>
Claude-Session: https://claude.ai/code/session_01AU333YXvwcrS2oXycGABJ3
</commit_message>
<xml_diff>
--- a/watch-output/2026-10-11_Facebook_不要再把PDF直接丟給AI-多做這3步品質差很多-AI超級大腦2小時線上講座__1Bggy9HRKs/2026-10-11_Facebook_不要再把PDF直接丟給AI-多做這3步品__1Bggy9HRKs_report.docx
+++ b/watch-output/2026-10-11_Facebook_不要再把PDF直接丟給AI-多做這3步品質差很多-AI超級大腦2小時線上講座__1Bggy9HRKs/2026-10-11_Facebook_不要再把PDF直接丟給AI-多做這3步品__1Bggy9HRKs_report.docx
@@ -19,8 +19,19 @@
           <w:rFonts w:ascii="Microsoft JhengHei" w:hAnsi="Microsoft JhengHei" w:eastAsia="Microsoft JhengHei"/>
           <w:sz w:val="21"/>
         </w:rPr>
-        <w:t>來源：https://www.facebook.com/share/v/1Bggy9HRKs/</w:t>
+        <w:t>來源：</w:t>
       </w:r>
+      <w:hyperlink r:id="rId9">
+        <w:r>
+          <w:rPr>
+            <w:rStyle w:val="Hyperlink"/>
+            <w:color w:val="0563C1"/>
+            <w:u w:val="single"/>
+            <w:sz w:val="21"/>
+          </w:rPr>
+          <w:t>https://www.facebook.com/share/v/1Bggy9HRKs/</w:t>
+        </w:r>
+      </w:hyperlink>
     </w:p>
     <w:p>
       <w:pPr>
@@ -107,7 +118,25 @@
           <w:rFonts w:ascii="Microsoft JhengHei" w:hAnsi="Microsoft JhengHei" w:eastAsia="Microsoft JhengHei"/>
           <w:sz w:val="21"/>
         </w:rPr>
-        <w:t>來源：https://www.facebook.com/share/v/1Bggy9HRKs/（上傳者：李佳達，長度 03:01）</w:t>
+        <w:t>來源：</w:t>
+      </w:r>
+      <w:hyperlink r:id="rId9">
+        <w:r>
+          <w:rPr>
+            <w:rStyle w:val="Hyperlink"/>
+            <w:color w:val="0563C1"/>
+            <w:u w:val="single"/>
+            <w:sz w:val="21"/>
+          </w:rPr>
+          <w:t>https://www.facebook.com/share/v/1Bggy9HRKs/</w:t>
+        </w:r>
+      </w:hyperlink>
+      <w:r>
+        <w:rPr>
+          <w:rFonts w:ascii="Microsoft JhengHei" w:hAnsi="Microsoft JhengHei" w:eastAsia="Microsoft JhengHei"/>
+          <w:sz w:val="21"/>
+        </w:rPr>
+        <w:t>（上傳者：李佳達，長度 03:01）</w:t>
       </w:r>
     </w:p>
     <w:p>
@@ -1073,7 +1102,7 @@
                     <pic:cNvPicPr/>
                   </pic:nvPicPr>
                   <pic:blipFill>
-                    <a:blip r:embed="rId9"/>
+                    <a:blip r:embed="rId10"/>
                     <a:stretch>
                       <a:fillRect/>
                     </a:stretch>
@@ -1146,7 +1175,7 @@
                     <pic:cNvPicPr/>
                   </pic:nvPicPr>
                   <pic:blipFill>
-                    <a:blip r:embed="rId10"/>
+                    <a:blip r:embed="rId11"/>
                     <a:stretch>
                       <a:fillRect/>
                     </a:stretch>
@@ -1219,7 +1248,7 @@
                     <pic:cNvPicPr/>
                   </pic:nvPicPr>
                   <pic:blipFill>
-                    <a:blip r:embed="rId11"/>
+                    <a:blip r:embed="rId12"/>
                     <a:stretch>
                       <a:fillRect/>
                     </a:stretch>
@@ -1292,7 +1321,7 @@
                     <pic:cNvPicPr/>
                   </pic:nvPicPr>
                   <pic:blipFill>
-                    <a:blip r:embed="rId12"/>
+                    <a:blip r:embed="rId13"/>
                     <a:stretch>
                       <a:fillRect/>
                     </a:stretch>
@@ -1365,7 +1394,7 @@
                     <pic:cNvPicPr/>
                   </pic:nvPicPr>
                   <pic:blipFill>
-                    <a:blip r:embed="rId13"/>
+                    <a:blip r:embed="rId14"/>
                     <a:stretch>
                       <a:fillRect/>
                     </a:stretch>
@@ -1438,7 +1467,7 @@
                     <pic:cNvPicPr/>
                   </pic:nvPicPr>
                   <pic:blipFill>
-                    <a:blip r:embed="rId14"/>
+                    <a:blip r:embed="rId15"/>
                     <a:stretch>
                       <a:fillRect/>
                     </a:stretch>
@@ -1511,7 +1540,7 @@
                     <pic:cNvPicPr/>
                   </pic:nvPicPr>
                   <pic:blipFill>
-                    <a:blip r:embed="rId15"/>
+                    <a:blip r:embed="rId16"/>
                     <a:stretch>
                       <a:fillRect/>
                     </a:stretch>
@@ -1584,7 +1613,7 @@
                     <pic:cNvPicPr/>
                   </pic:nvPicPr>
                   <pic:blipFill>
-                    <a:blip r:embed="rId16"/>
+                    <a:blip r:embed="rId17"/>
                     <a:stretch>
                       <a:fillRect/>
                     </a:stretch>
@@ -1657,7 +1686,7 @@
                     <pic:cNvPicPr/>
                   </pic:nvPicPr>
                   <pic:blipFill>
-                    <a:blip r:embed="rId17"/>
+                    <a:blip r:embed="rId18"/>
                     <a:stretch>
                       <a:fillRect/>
                     </a:stretch>

</xml_diff>